<commit_message>
Polish GUI: PDF-accurate room layout, Friday slot grid, GIK logo, semester wording
- timetable_view: rebuilt BUILDING_ROOMS to match exporter; Friday now renders 10:00/11:00/12:00 morning grid; dynamic Labs section for virtual lab rooms; added missing CS LH4, EE LH1-3, ES LH4, Quiz Halls
- main_window: GIK logo in sidebar + window icon; renamed 'Weekly Timetable' to 'Semester Timetable'
- upload_panel: 'Generate the semester schedule.'
- config: CY/AI/DA labs primary in Acad. Block (verified with student); added FBS Lab to FCSE-SE Lab backup chain
- timetable_parser: removed FCSE - CyS Lab from defaults (only SE Lab is in FCSE)
- build_report / README: 'semester' wording throughout, regenerated docx
</commit_message>
<xml_diff>
--- a/report/GIK_Timetable_Scheduler_Report.docx
+++ b/report/GIK_Timetable_Scheduler_Report.docx
@@ -83,7 +83,7 @@
           <w:i w:val="0"/>
           <w:sz w:val="36"/>
         </w:rPr>
-        <w:t>Automated Weekly Timetable Generation for GIK Institute</w:t>
+        <w:t>Automated Semester Timetable Generation for GIK Institute</w:t>
       </w:r>
     </w:p>
     <w:p>
@@ -243,7 +243,7 @@
           <w:i w:val="0"/>
           <w:sz w:val="28"/>
         </w:rPr>
-        <w:t>Automated Weekly Timetable Generation for GIK Institute</w:t>
+        <w:t>Automated Semester Timetable Generation for GIK Institute</w:t>
       </w:r>
     </w:p>
     <w:p>
@@ -295,7 +295,7 @@
           <w:i/>
           <w:sz w:val="18"/>
         </w:rPr>
-        <w:t>Manually preparing the GIK Institute weekly timetable is a slow, error-prone exercise. It involves placing roughly 460 course sections into a fixed grid of rooms and time slots while preventing teachers, classrooms, and student groups from clashing. We present an automated scheduler built around a greedy constraint-satisfaction routine that orders course sessions by how tightly constrained they are, then drops each one into the highest-scoring (slot, room) pair its domain still allows. Our implementation handles 462 sections (1015 individual session-slots) from the actual Spring 2026 catalogue in 0.6 seconds on a laptop, with no room conflicts, no instructor double-bookings, and no course scheduled twice on the same day. The output Excel file mirrors the layout of the institute's official timetable PDF. The work was guided by reverse-engineering that PDF, which exposed several non-obvious institutional rules our first algorithm version missed.</w:t>
+        <w:t>Manually preparing the GIK Institute semester timetable is a slow, error-prone exercise. The schedule is published once per semester as a recurring weekly grid that all five working days follow, and it involves placing roughly 460 course sections into a fixed pattern of rooms and time slots while preventing teachers, classrooms, and student groups from clashing. We present an automated scheduler built around a greedy constraint-satisfaction routine that orders course sessions by how tightly constrained they are, then drops each one into the highest-scoring (slot, room) pair its domain still allows. Our implementation handles 462 sections (1015 individual session-slots) from the actual Spring 2026 catalogue in 0.6 seconds on a laptop, with no room conflicts, no instructor double-bookings, and no course scheduled twice on the same day. The output Excel file mirrors the layout of the institute's official timetable PDF. The work was guided by reverse-engineering that PDF, which exposed several non-obvious institutional rules our first algorithm version missed.</w:t>
       </w:r>
     </w:p>
     <w:p>
@@ -348,7 +348,7 @@
           <w:i w:val="0"/>
           <w:sz w:val="20"/>
         </w:rPr>
-        <w:t>Every semester at GIK Institute, the Director of Admissions and Examinations releases a printed weekly timetable that places hundreds of course sections into a grid of physical rooms and 50-minute slots running from 8 a.m. through 5:20 p.m., Monday to Friday. The current process of preparing this grid is largely manual. A staff member edits a master spreadsheet, watches out for clashes by hand, and reflows the schedule whenever a conflict turns up. With around 460 sections to place and seven separate faculty buildings to keep straight, it is easy for a small mistake to snowball into a series of corrections.</w:t>
+        <w:t>Every semester at GIK Institute, the Director of Admissions and Examinations releases a printed semester timetable that places hundreds of course sections into a recurring weekly grid of physical rooms and 50-minute slots running from 8 a.m. through 5:20 p.m., Monday to Friday. The same pattern is then followed for every week of the semester. The current process of preparing this grid is largely manual. A staff member edits a master spreadsheet, watches out for clashes by hand, and reflows the schedule whenever a conflict turns up. With around 460 sections to place and seven separate faculty buildings to keep straight, it is easy for a small mistake to snowball into a series of corrections.</w:t>
       </w:r>
     </w:p>
     <w:p>
@@ -364,7 +364,7 @@
           <w:i w:val="0"/>
           <w:sz w:val="20"/>
         </w:rPr>
-        <w:t>The aim of this project is to automate that work. Given a list of courses (each with credit hours, instructor, expected enrolment, and section identifier) and a list of available rooms, the program must produce a weekly timetable that respects every hard institutional rule and tries to do well on a handful of softer goals like avoiding gaps for students and not stacking long lecture chains on a single instructor. The official Spring 2026 PDF was the reference for the structural rules — for instance, that Friday morning runs on a slightly different time grid because of Jumuʼah, or that Chemistry classes live in the Academic Block rather than the Materials Engineering wing.</w:t>
+        <w:t>The aim of this project is to automate that work. Given a list of courses (each with credit hours, instructor, expected enrolment, and section identifier) and a list of available rooms, the program must produce a semester timetable that respects every hard institutional rule and tries to do well on a handful of softer goals like avoiding gaps for students and not stacking long lecture chains on a single instructor. The official Spring 2026 PDF was the reference for the structural rules — for instance, that Friday morning runs on a slightly different time grid because of Jumuʼah, or that Chemistry classes live in the Academic Block rather than the Materials Engineering wing.</w:t>
       </w:r>
     </w:p>
     <w:p>

</xml_diff>